<commit_message>
Update offer letter template with dynamic placeholders
Replace hardcoded values in the offer letter document with dynamic placeholders using a conversion script.

Replit-Commit-Author: Agent
Replit-Commit-Session-Id: 7bf5aeac-9bdf-4497-ad87-f1a2119826a0
Replit-Commit-Checkpoint-Type: full_checkpoint
Replit-Commit-Event-Id: 90f962f0-b780-48bf-81dc-60b8652c304f
Replit-Commit-Screenshot-Url: https://storage.googleapis.com/screenshot-production-us-central1/6e57f44f-baf8-42e1-87c9-1798c284d2de/7bf5aeac-9bdf-4497-ad87-f1a2119826a0/QIN4j1W
</commit_message>
<xml_diff>
--- a/data/templates/system_offer_letter.docx
+++ b/data/templates/system_offer_letter.docx
@@ -15,83 +15,83 @@
           <w:szCs w:val="18"/>
           <w:rtl w:val="0"/>
         </w:rPr>
-        <w:t xml:space="preserve">BUSINESS NAME</w:t>
-      </w:r>
-    </w:p>
-    <w:p>
-      <w:pPr>
-        <w:rPr>
-          <w:sz w:val="18"/>
-          <w:szCs w:val="18"/>
-        </w:rPr>
-      </w:pPr>
-      <w:r>
-        <w:rPr>
-          <w:sz w:val="18"/>
-          <w:szCs w:val="18"/>
-          <w:rtl w:val="0"/>
-        </w:rPr>
-        <w:t xml:space="preserve">BUSINESS ADDRESS </w:t>
-      </w:r>
-    </w:p>
-    <w:p>
-      <w:pPr>
-        <w:rPr>
-          <w:sz w:val="18"/>
-          <w:szCs w:val="18"/>
-        </w:rPr>
-      </w:pPr>
-      <w:r>
-        <w:rPr>
-          <w:rtl w:val="0"/>
-        </w:rPr>
-      </w:r>
-    </w:p>
-    <w:p>
-      <w:pPr>
-        <w:rPr>
-          <w:sz w:val="18"/>
-          <w:szCs w:val="18"/>
-        </w:rPr>
-      </w:pPr>
-      <w:r>
-        <w:rPr>
-          <w:sz w:val="18"/>
-          <w:szCs w:val="18"/>
-          <w:rtl w:val="0"/>
-        </w:rPr>
-        <w:t xml:space="preserve">04/03/2022 </w:t>
-      </w:r>
-    </w:p>
-    <w:p>
-      <w:pPr>
-        <w:rPr>
-          <w:sz w:val="18"/>
-          <w:szCs w:val="18"/>
-        </w:rPr>
-      </w:pPr>
-      <w:r>
-        <w:rPr>
-          <w:rtl w:val="0"/>
-        </w:rPr>
-      </w:r>
-    </w:p>
-    <w:p>
-      <w:pPr>
-        <w:rPr>
-          <w:b w:val="1"/>
-          <w:sz w:val="18"/>
-          <w:szCs w:val="18"/>
-        </w:rPr>
-      </w:pPr>
-      <w:r>
-        <w:rPr>
-          <w:b w:val="1"/>
-          <w:sz w:val="18"/>
-          <w:szCs w:val="18"/>
-          <w:rtl w:val="0"/>
-        </w:rPr>
-        <w:t xml:space="preserve">Re: BUSINESS NAME </w:t>
+        <w:t xml:space="preserve">{{sellerCompanyName}}</w:t>
+      </w:r>
+    </w:p>
+    <w:p>
+      <w:pPr>
+        <w:rPr>
+          <w:sz w:val="18"/>
+          <w:szCs w:val="18"/>
+        </w:rPr>
+      </w:pPr>
+      <w:r>
+        <w:rPr>
+          <w:sz w:val="18"/>
+          <w:szCs w:val="18"/>
+          <w:rtl w:val="0"/>
+        </w:rPr>
+        <w:t xml:space="preserve">{{sellerAddress}} </w:t>
+      </w:r>
+    </w:p>
+    <w:p>
+      <w:pPr>
+        <w:rPr>
+          <w:sz w:val="18"/>
+          <w:szCs w:val="18"/>
+        </w:rPr>
+      </w:pPr>
+      <w:r>
+        <w:rPr>
+          <w:rtl w:val="0"/>
+        </w:rPr>
+      </w:r>
+    </w:p>
+    <w:p>
+      <w:pPr>
+        <w:rPr>
+          <w:sz w:val="18"/>
+          <w:szCs w:val="18"/>
+        </w:rPr>
+      </w:pPr>
+      <w:r>
+        <w:rPr>
+          <w:sz w:val="18"/>
+          <w:szCs w:val="18"/>
+          <w:rtl w:val="0"/>
+        </w:rPr>
+        <w:t xml:space="preserve">{{currentDate}} </w:t>
+      </w:r>
+    </w:p>
+    <w:p>
+      <w:pPr>
+        <w:rPr>
+          <w:sz w:val="18"/>
+          <w:szCs w:val="18"/>
+        </w:rPr>
+      </w:pPr>
+      <w:r>
+        <w:rPr>
+          <w:rtl w:val="0"/>
+        </w:rPr>
+      </w:r>
+    </w:p>
+    <w:p>
+      <w:pPr>
+        <w:rPr>
+          <w:b w:val="1"/>
+          <w:sz w:val="18"/>
+          <w:szCs w:val="18"/>
+        </w:rPr>
+      </w:pPr>
+      <w:r>
+        <w:rPr>
+          <w:b w:val="1"/>
+          <w:sz w:val="18"/>
+          <w:szCs w:val="18"/>
+          <w:rtl w:val="0"/>
+        </w:rPr>
+        <w:t xml:space="preserve">Re: {{sellerCompanyName}} </w:t>
       </w:r>
     </w:p>
     <w:p>
@@ -149,95 +149,71 @@
           <w:szCs w:val="18"/>
           <w:rtl w:val="0"/>
         </w:rPr>
-        <w:t xml:space="preserve">The total consideration is £8,500,000, which is comprised as follows: </w:t>
-      </w:r>
-    </w:p>
-    <w:p>
-      <w:pPr>
-        <w:rPr>
-          <w:sz w:val="18"/>
-          <w:szCs w:val="18"/>
-        </w:rPr>
-      </w:pPr>
-      <w:r>
-        <w:rPr>
-          <w:rtl w:val="0"/>
-        </w:rPr>
-      </w:r>
-    </w:p>
-    <w:p>
-      <w:pPr>
-        <w:rPr>
-          <w:sz w:val="18"/>
-          <w:szCs w:val="18"/>
-        </w:rPr>
-      </w:pPr>
-      <w:r>
-        <w:rPr>
-          <w:b w:val="1"/>
-          <w:sz w:val="18"/>
-          <w:szCs w:val="18"/>
-          <w:rtl w:val="0"/>
-        </w:rPr>
-        <w:t xml:space="preserve">Good Will: </w:t>
-      </w:r>
-      <w:r>
-        <w:rPr>
-          <w:sz w:val="18"/>
-          <w:szCs w:val="18"/>
-          <w:rtl w:val="0"/>
-        </w:rPr>
-        <w:t xml:space="preserve">£4,200,000 </w:t>
-      </w:r>
-    </w:p>
-    <w:p>
-      <w:pPr>
-        <w:rPr>
-          <w:sz w:val="18"/>
-          <w:szCs w:val="18"/>
-        </w:rPr>
-      </w:pPr>
-      <w:r>
-        <w:rPr>
-          <w:b w:val="1"/>
-          <w:sz w:val="18"/>
-          <w:szCs w:val="18"/>
-          <w:rtl w:val="0"/>
-        </w:rPr>
-        <w:t xml:space="preserve">Cash in Bank:</w:t>
-      </w:r>
-      <w:r>
-        <w:rPr>
-          <w:sz w:val="18"/>
-          <w:szCs w:val="18"/>
-          <w:rtl w:val="0"/>
-        </w:rPr>
-        <w:t xml:space="preserve"> £4,300,000 </w:t>
-      </w:r>
-    </w:p>
-    <w:p>
-      <w:pPr>
-        <w:rPr>
-          <w:sz w:val="18"/>
-          <w:szCs w:val="18"/>
-        </w:rPr>
-      </w:pPr>
-      <w:r>
-        <w:rPr>
-          <w:b w:val="1"/>
-          <w:sz w:val="18"/>
-          <w:szCs w:val="18"/>
-          <w:rtl w:val="0"/>
-        </w:rPr>
-        <w:t xml:space="preserve">Total: </w:t>
-      </w:r>
-      <w:r>
-        <w:rPr>
-          <w:sz w:val="18"/>
-          <w:szCs w:val="18"/>
-          <w:rtl w:val="0"/>
-        </w:rPr>
-        <w:t xml:space="preserve">£8,500,000 </w:t>
+        <w:t xml:space="preserve">The total consideration is {{offerPrice}}, which is comprised as follows: </w:t>
+      </w:r>
+    </w:p>
+    <w:p>
+      <w:pPr>
+        <w:rPr>
+          <w:sz w:val="18"/>
+          <w:szCs w:val="18"/>
+        </w:rPr>
+      </w:pPr>
+      <w:r>
+        <w:rPr>
+          <w:rtl w:val="0"/>
+        </w:rPr>
+      </w:r>
+    </w:p>
+    <w:p>
+      <w:pPr>
+        <w:rPr>
+          <w:sz w:val="18"/>
+          <w:szCs w:val="18"/>
+        </w:rPr>
+      </w:pPr>
+      <w:r>
+        <w:rPr>
+          <w:b w:val="1"/>
+          <w:sz w:val="18"/>
+          <w:szCs w:val="18"/>
+          <w:rtl w:val="0"/>
+        </w:rPr>
+        <w:t xml:space="preserve">Good Will: {{enterpriseValue}} </w:t>
+      </w:r>
+    </w:p>
+    <w:p>
+      <w:pPr>
+        <w:rPr>
+          <w:sz w:val="18"/>
+          <w:szCs w:val="18"/>
+        </w:rPr>
+      </w:pPr>
+      <w:r>
+        <w:rPr>
+          <w:b w:val="1"/>
+          <w:sz w:val="18"/>
+          <w:szCs w:val="18"/>
+          <w:rtl w:val="0"/>
+        </w:rPr>
+        <w:t xml:space="preserve">Cash in Bank: {{excessCash}} </w:t>
+      </w:r>
+    </w:p>
+    <w:p>
+      <w:pPr>
+        <w:rPr>
+          <w:sz w:val="18"/>
+          <w:szCs w:val="18"/>
+        </w:rPr>
+      </w:pPr>
+      <w:r>
+        <w:rPr>
+          <w:b w:val="1"/>
+          <w:sz w:val="18"/>
+          <w:szCs w:val="18"/>
+          <w:rtl w:val="0"/>
+        </w:rPr>
+        <w:t xml:space="preserve">Total: {{offerPrice}} </w:t>
       </w:r>
     </w:p>
     <w:p>
@@ -264,16 +240,7 @@
           <w:szCs w:val="18"/>
           <w:rtl w:val="0"/>
         </w:rPr>
-        <w:t xml:space="preserve">Payment due to the seller at closing:</w:t>
-      </w:r>
-      <w:r>
-        <w:rPr>
-          <w:b w:val="1"/>
-          <w:sz w:val="18"/>
-          <w:szCs w:val="18"/>
-          <w:rtl w:val="0"/>
-        </w:rPr>
-        <w:t xml:space="preserve"> £1,600,000 + Cash in bank (Est £4,300,000) </w:t>
+        <w:t xml:space="preserve">Payment due to the seller at closing: {{dayOnePayment}} + Cash in bank (Est {{excessCash}}) </w:t>
       </w:r>
     </w:p>
     <w:p>
@@ -333,159 +300,114 @@
           <w:szCs w:val="18"/>
           <w:rtl w:val="0"/>
         </w:rPr>
-        <w:t xml:space="preserve">At 12 months following closing: </w:t>
-      </w:r>
-      <w:r>
-        <w:rPr>
-          <w:b w:val="1"/>
-          <w:sz w:val="18"/>
-          <w:szCs w:val="18"/>
-          <w:rtl w:val="0"/>
-        </w:rPr>
-        <w:t xml:space="preserve">£520,000</w:t>
-      </w:r>
-    </w:p>
-    <w:p>
-      <w:pPr>
-        <w:rPr>
-          <w:sz w:val="18"/>
-          <w:szCs w:val="18"/>
-        </w:rPr>
-      </w:pPr>
-      <w:r>
-        <w:rPr>
-          <w:sz w:val="18"/>
-          <w:szCs w:val="18"/>
-          <w:rtl w:val="0"/>
-        </w:rPr>
-        <w:t xml:space="preserve">At 24 months following closing: </w:t>
-      </w:r>
-      <w:r>
-        <w:rPr>
-          <w:b w:val="1"/>
-          <w:sz w:val="18"/>
-          <w:szCs w:val="18"/>
-          <w:rtl w:val="0"/>
-        </w:rPr>
-        <w:t xml:space="preserve">£520,000</w:t>
-      </w:r>
-      <w:r>
-        <w:rPr>
-          <w:rtl w:val="0"/>
-        </w:rPr>
-      </w:r>
-    </w:p>
-    <w:p>
-      <w:pPr>
-        <w:rPr>
-          <w:sz w:val="18"/>
-          <w:szCs w:val="18"/>
-        </w:rPr>
-      </w:pPr>
-      <w:r>
-        <w:rPr>
-          <w:sz w:val="18"/>
-          <w:szCs w:val="18"/>
-          <w:rtl w:val="0"/>
-        </w:rPr>
-        <w:t xml:space="preserve">At 36 months following closing: </w:t>
-      </w:r>
-      <w:r>
-        <w:rPr>
-          <w:b w:val="1"/>
-          <w:sz w:val="18"/>
-          <w:szCs w:val="18"/>
-          <w:rtl w:val="0"/>
-        </w:rPr>
-        <w:t xml:space="preserve">£520,000</w:t>
-      </w:r>
-      <w:r>
-        <w:rPr>
-          <w:rtl w:val="0"/>
-        </w:rPr>
-      </w:r>
-    </w:p>
-    <w:p>
-      <w:pPr>
-        <w:rPr>
-          <w:b w:val="1"/>
-          <w:sz w:val="18"/>
-          <w:szCs w:val="18"/>
-        </w:rPr>
-      </w:pPr>
-      <w:r>
-        <w:rPr>
-          <w:sz w:val="18"/>
-          <w:szCs w:val="18"/>
-          <w:rtl w:val="0"/>
-        </w:rPr>
-        <w:t xml:space="preserve">At 48 months following closing: </w:t>
-      </w:r>
-      <w:r>
-        <w:rPr>
-          <w:b w:val="1"/>
-          <w:sz w:val="18"/>
-          <w:szCs w:val="18"/>
-          <w:rtl w:val="0"/>
-        </w:rPr>
-        <w:t xml:space="preserve">£520,000</w:t>
-      </w:r>
-    </w:p>
-    <w:p>
-      <w:pPr>
-        <w:rPr>
-          <w:b w:val="1"/>
-          <w:sz w:val="18"/>
-          <w:szCs w:val="18"/>
-        </w:rPr>
-      </w:pPr>
-      <w:r>
-        <w:rPr>
-          <w:sz w:val="18"/>
-          <w:szCs w:val="18"/>
-          <w:rtl w:val="0"/>
-        </w:rPr>
-        <w:t xml:space="preserve">At 60 months following closing: </w:t>
-      </w:r>
-      <w:r>
-        <w:rPr>
-          <w:b w:val="1"/>
-          <w:sz w:val="18"/>
-          <w:szCs w:val="18"/>
-          <w:rtl w:val="0"/>
-        </w:rPr>
-        <w:t xml:space="preserve">£520,000</w:t>
-      </w:r>
-    </w:p>
-    <w:p>
-      <w:pPr>
-        <w:rPr>
-          <w:b w:val="1"/>
-          <w:sz w:val="18"/>
-          <w:szCs w:val="18"/>
-        </w:rPr>
-      </w:pPr>
-      <w:r>
-        <w:rPr>
-          <w:rtl w:val="0"/>
-        </w:rPr>
-      </w:r>
-    </w:p>
-    <w:p>
-      <w:pPr>
-        <w:rPr>
-          <w:sz w:val="18"/>
-          <w:szCs w:val="18"/>
-        </w:rPr>
-      </w:pPr>
-      <w:r>
-        <w:rPr>
-          <w:b w:val="1"/>
-          <w:sz w:val="18"/>
-          <w:szCs w:val="18"/>
-          <w:rtl w:val="0"/>
-        </w:rPr>
-        <w:t xml:space="preserve">                                        Total: £2,600,000 </w:t>
+        <w:t xml:space="preserve">At 12 months following closing: {{deferredInstalment}}</w:t>
+      </w:r>
+    </w:p>
+    <w:p>
+      <w:pPr>
+        <w:rPr>
+          <w:sz w:val="18"/>
+          <w:szCs w:val="18"/>
+        </w:rPr>
+      </w:pPr>
+      <w:r>
+        <w:rPr>
+          <w:sz w:val="18"/>
+          <w:szCs w:val="18"/>
+          <w:rtl w:val="0"/>
+        </w:rPr>
+        <w:t xml:space="preserve">At 24 months following closing: {{deferredInstalment}}</w:t>
+      </w:r>
+      <w:r>
+        <w:rPr>
+          <w:rtl w:val="0"/>
+        </w:rPr>
+      </w:r>
+    </w:p>
+    <w:p>
+      <w:pPr>
+        <w:rPr>
+          <w:sz w:val="18"/>
+          <w:szCs w:val="18"/>
+        </w:rPr>
+      </w:pPr>
+      <w:r>
+        <w:rPr>
+          <w:sz w:val="18"/>
+          <w:szCs w:val="18"/>
+          <w:rtl w:val="0"/>
+        </w:rPr>
+        <w:t xml:space="preserve">At 36 months following closing: {{deferredInstalment}}</w:t>
+      </w:r>
+      <w:r>
+        <w:rPr>
+          <w:rtl w:val="0"/>
+        </w:rPr>
+      </w:r>
+    </w:p>
+    <w:p>
+      <w:pPr>
+        <w:rPr>
+          <w:b w:val="1"/>
+          <w:sz w:val="18"/>
+          <w:szCs w:val="18"/>
+        </w:rPr>
+      </w:pPr>
+      <w:r>
+        <w:rPr>
+          <w:sz w:val="18"/>
+          <w:szCs w:val="18"/>
+          <w:rtl w:val="0"/>
+        </w:rPr>
+        <w:t xml:space="preserve">At 48 months following closing: {{deferredInstalment}}</w:t>
+      </w:r>
+    </w:p>
+    <w:p>
+      <w:pPr>
+        <w:rPr>
+          <w:b w:val="1"/>
+          <w:sz w:val="18"/>
+          <w:szCs w:val="18"/>
+        </w:rPr>
+      </w:pPr>
+      <w:r>
+        <w:rPr>
+          <w:sz w:val="18"/>
+          <w:szCs w:val="18"/>
+          <w:rtl w:val="0"/>
+        </w:rPr>
+        <w:t xml:space="preserve">At 60 months following closing: {{deferredInstalment}}</w:t>
+      </w:r>
+    </w:p>
+    <w:p>
+      <w:pPr>
+        <w:rPr>
+          <w:b w:val="1"/>
+          <w:sz w:val="18"/>
+          <w:szCs w:val="18"/>
+        </w:rPr>
+      </w:pPr>
+      <w:r>
+        <w:rPr>
+          <w:rtl w:val="0"/>
+        </w:rPr>
+      </w:r>
+    </w:p>
+    <w:p>
+      <w:pPr>
+        <w:rPr>
+          <w:sz w:val="18"/>
+          <w:szCs w:val="18"/>
+        </w:rPr>
+      </w:pPr>
+      <w:r>
+        <w:rPr>
+          <w:b w:val="1"/>
+          <w:sz w:val="18"/>
+          <w:szCs w:val="18"/>
+          <w:rtl w:val="0"/>
+        </w:rPr>
+        <w:t xml:space="preserve">                                        Total: {{deferredTotal}} </w:t>
       </w:r>
       <w:r>
         <w:rPr>
@@ -577,41 +499,41 @@
           <w:szCs w:val="18"/>
           <w:rtl w:val="0"/>
         </w:rPr>
-        <w:t xml:space="preserve">Daniel Ludlow</w:t>
-      </w:r>
-    </w:p>
-    <w:p>
-      <w:pPr>
-        <w:rPr>
-          <w:b w:val="1"/>
-          <w:sz w:val="18"/>
-          <w:szCs w:val="18"/>
-        </w:rPr>
-      </w:pPr>
-      <w:r>
-        <w:rPr>
-          <w:b w:val="1"/>
-          <w:sz w:val="18"/>
-          <w:szCs w:val="18"/>
-          <w:rtl w:val="0"/>
-        </w:rPr>
-        <w:t xml:space="preserve">Managing Director </w:t>
-      </w:r>
-    </w:p>
-    <w:p>
-      <w:pPr>
-        <w:rPr>
-          <w:sz w:val="18"/>
-          <w:szCs w:val="18"/>
-        </w:rPr>
-      </w:pPr>
-      <w:r>
-        <w:rPr>
-          <w:sz w:val="18"/>
-          <w:szCs w:val="18"/>
-          <w:rtl w:val="0"/>
-        </w:rPr>
-        <w:t xml:space="preserve">5D Capital Partners LLC </w:t>
+        <w:t xml:space="preserve">{{buyerSignatoryName}}</w:t>
+      </w:r>
+    </w:p>
+    <w:p>
+      <w:pPr>
+        <w:rPr>
+          <w:b w:val="1"/>
+          <w:sz w:val="18"/>
+          <w:szCs w:val="18"/>
+        </w:rPr>
+      </w:pPr>
+      <w:r>
+        <w:rPr>
+          <w:b w:val="1"/>
+          <w:sz w:val="18"/>
+          <w:szCs w:val="18"/>
+          <w:rtl w:val="0"/>
+        </w:rPr>
+        <w:t xml:space="preserve">{{buyerSignatoryTitle}} </w:t>
+      </w:r>
+    </w:p>
+    <w:p>
+      <w:pPr>
+        <w:rPr>
+          <w:sz w:val="18"/>
+          <w:szCs w:val="18"/>
+        </w:rPr>
+      </w:pPr>
+      <w:r>
+        <w:rPr>
+          <w:sz w:val="18"/>
+          <w:szCs w:val="18"/>
+          <w:rtl w:val="0"/>
+        </w:rPr>
+        <w:t xml:space="preserve">{{buyerCompanyName}} </w:t>
       </w:r>
       <w:r>
         <w:rPr>

</xml_diff>

<commit_message>
Update offer letter template and payment details for deals
Update the offer letter template to include dynamic transaction descriptions and type labels. Modify the deal document service to better handle deferred payment structures and add a new field for transaction descriptions.

Replit-Commit-Author: Agent
Replit-Commit-Session-Id: 157c3693-54b0-44c6-80ba-639899e313d5
Replit-Commit-Checkpoint-Type: full_checkpoint
Replit-Commit-Event-Id: aea9921b-e2e1-47c5-b8ad-8ab0f0b96779
Replit-Commit-Screenshot-Url: https://storage.googleapis.com/screenshot-production-us-central1/85fb53ef-8f2a-4b29-b64b-c651f49dfeb5/157c3693-54b0-44c6-80ba-639899e313d5/WLct7fT
Replit-Helium-Checkpoint-Created: true
</commit_message>
<xml_diff>
--- a/data/templates/system_offer_letter.docx
+++ b/data/templates/system_offer_letter.docx
@@ -1,318 +1,138 @@
 
 <file path=word/document.xml><?xml version="1.0" encoding="utf-8"?>
-<w:document xmlns:wpc="http://schemas.microsoft.com/office/word/2010/wordprocessingCanvas" xmlns:mo="http://schemas.microsoft.com/office/mac/office/2008/main" xmlns:mc="http://schemas.openxmlformats.org/markup-compatibility/2006" xmlns:mv="urn:schemas-microsoft-com:mac:vml" xmlns:o="urn:schemas-microsoft-com:office:office" xmlns:r="http://schemas.openxmlformats.org/officeDocument/2006/relationships" xmlns:m="http://schemas.openxmlformats.org/officeDocument/2006/math" xmlns:v="urn:schemas-microsoft-com:vml" xmlns:wp14="http://schemas.microsoft.com/office/word/2010/wordprocessingDrawing" xmlns:wp="http://schemas.openxmlformats.org/drawingml/2006/wordprocessingDrawing" xmlns:w10="urn:schemas-microsoft-com:office:word" xmlns:w="http://schemas.openxmlformats.org/wordprocessingml/2006/main" xmlns:w14="http://schemas.microsoft.com/office/word/2010/wordml" xmlns:wpg="http://schemas.microsoft.com/office/word/2010/wordprocessingGroup" xmlns:wpi="http://schemas.microsoft.com/office/word/2010/wordprocessingInk" xmlns:wne="http://schemas.microsoft.com/office/word/2006/wordml" xmlns:wps="http://schemas.microsoft.com/office/word/2010/wordprocessingShape" mc:Ignorable="w14 wp14">
+<w:document xmlns:wpc="http://schemas.microsoft.com/office/word/2010/wordprocessingCanvas" xmlns:w="http://schemas.openxmlformats.org/wordprocessingml/2006/main">
   <w:body>
-    <!-- Seller company header -->
-    <w:p>
-      <w:pPr>
-        <w:rPr>
-          <w:b/>
-          <w:sz w:val="24"/>
-        </w:rPr>
-      </w:pPr>
-      <w:r>
-        <w:rPr>
-          <w:b/>
-          <w:sz w:val="24"/>
-        </w:rPr>
+    <w:p>
+      <w:r>
         <w:t>{{sellerCompanyName}}</w:t>
       </w:r>
     </w:p>
     <w:p>
-      <w:pPr>
-        <w:rPr>
-          <w:sz w:val="20"/>
-        </w:rPr>
-      </w:pPr>
-      <w:r>
-        <w:rPr>
-          <w:sz w:val="20"/>
-        </w:rPr>
+      <w:r>
         <w:t>{{sellerAddress}}</w:t>
       </w:r>
     </w:p>
-    <!-- Spacer -->
-    <w:p>
-      <w:pPr>
-        <w:rPr>
-          <w:sz w:val="20"/>
-        </w:rPr>
-      </w:pPr>
-    </w:p>
-    <!-- Date -->
-    <w:p>
-      <w:pPr>
-        <w:rPr>
-          <w:sz w:val="20"/>
-        </w:rPr>
-      </w:pPr>
-      <w:r>
-        <w:rPr>
-          <w:sz w:val="20"/>
-        </w:rPr>
+    <w:p>
+      <w:r>
+        <w:t/>
+      </w:r>
+    </w:p>
+    <w:p>
+      <w:r>
         <w:t>{{currentDate}}</w:t>
       </w:r>
     </w:p>
-    <!-- Spacer -->
-    <w:p>
-      <w:pPr>
-        <w:rPr>
-          <w:sz w:val="20"/>
-        </w:rPr>
-      </w:pPr>
-    </w:p>
-    <!-- Re: line -->
-    <w:p>
-      <w:pPr>
-        <w:rPr>
-          <w:b/>
-          <w:sz w:val="20"/>
-        </w:rPr>
-      </w:pPr>
-      <w:r>
-        <w:rPr>
-          <w:b/>
-          <w:sz w:val="20"/>
-        </w:rPr>
-        <w:t>Re: {{sellerCompanyName}}</w:t>
-      </w:r>
-    </w:p>
-    <!-- Spacer -->
-    <w:p>
-      <w:pPr>
-        <w:rPr>
-          <w:sz w:val="20"/>
-        </w:rPr>
-      </w:pPr>
-    </w:p>
-    <!-- Opening paragraph -->
-    <w:p>
-      <w:pPr>
-        <w:rPr>
-          <w:sz w:val="20"/>
-        </w:rPr>
-      </w:pPr>
-      <w:r>
-        <w:rPr>
-          <w:sz w:val="20"/>
-        </w:rPr>
-        <w:t xml:space="preserve">Further to our conversations, I have the pleasure of enclosing an offer for 100% of the share capital of {{sellerCompanyName}}.</w:t>
-      </w:r>
-    </w:p>
-    <!-- Spacer -->
-    <w:p>
-      <w:pPr>
-        <w:rPr>
-          <w:sz w:val="20"/>
-        </w:rPr>
-      </w:pPr>
-    </w:p>
-    <!-- Offer Price -->
-    <w:p>
-      <w:pPr>
-        <w:rPr>
-          <w:b/>
-          <w:sz w:val="22"/>
-        </w:rPr>
-      </w:pPr>
-      <w:r>
-        <w:rPr>
-          <w:b/>
-          <w:sz w:val="22"/>
-        </w:rPr>
+    <w:p>
+      <w:r>
+        <w:t/>
+      </w:r>
+    </w:p>
+    <w:p>
+      <w:r>
+        <w:t>Re: Indicative Offer — {{sellerCompanyName}} ({{transactionTypeLabel}})</w:t>
+      </w:r>
+    </w:p>
+    <w:p>
+      <w:r>
+        <w:t/>
+      </w:r>
+    </w:p>
+    <w:p>
+      <w:r>
+        <w:t>Further to our conversations, I have the pleasure of enclosing an indicative offer for {{transactionDescription}} of {{sellerCompanyName}}.</w:t>
+      </w:r>
+    </w:p>
+    <w:p>
+      <w:r>
+        <w:t/>
+      </w:r>
+    </w:p>
+    <w:p>
+      <w:r>
         <w:t>The total offer price is {{offerPrice}}</w:t>
       </w:r>
     </w:p>
-    <!-- Spacer -->
-    <w:p>
-      <w:pPr>
-        <w:rPr>
-          <w:sz w:val="20"/>
-        </w:rPr>
-      </w:pPr>
-    </w:p>
-    <!-- Breakdown header -->
-    <w:p>
-      <w:pPr>
-        <w:rPr>
-          <w:b/>
-          <w:sz w:val="20"/>
-        </w:rPr>
-      </w:pPr>
-      <w:r>
-        <w:rPr>
-          <w:b/>
-          <w:sz w:val="20"/>
-        </w:rPr>
+    <w:p>
+      <w:r>
+        <w:t/>
+      </w:r>
+    </w:p>
+    <w:p>
+      <w:r>
         <w:t>This is comprised as follows:</w:t>
       </w:r>
     </w:p>
-    <!-- Spacer -->
-    <w:p>
-      <w:pPr>
-        <w:rPr>
-          <w:sz w:val="20"/>
-        </w:rPr>
-      </w:pPr>
-    </w:p>
-    <!-- Enterprise Value -->
-    <w:p>
-      <w:pPr>
-        <w:rPr>
-          <w:sz w:val="20"/>
-        </w:rPr>
-      </w:pPr>
-      <w:r>
-        <w:rPr>
-          <w:sz w:val="20"/>
-        </w:rPr>
+    <w:p>
+      <w:r>
+        <w:t/>
+      </w:r>
+    </w:p>
+    <w:p>
+      <w:r>
         <w:t>{{breakdownText}}</w:t>
       </w:r>
     </w:p>
-    <!-- Spacer -->
-    <w:p>
-      <w:pPr>
-        <w:rPr>
-          <w:sz w:val="20"/>
-        </w:rPr>
-      </w:pPr>
-    </w:p>
-    <!-- Payment Structure header -->
-    <w:p>
-      <w:pPr>
-        <w:rPr>
-          <w:b/>
-          <w:sz w:val="20"/>
-        </w:rPr>
-      </w:pPr>
-      <w:r>
-        <w:rPr>
-          <w:b/>
-          <w:sz w:val="20"/>
-        </w:rPr>
+    <w:p>
+      <w:r>
+        <w:t/>
+      </w:r>
+    </w:p>
+    <w:p>
+      <w:r>
         <w:t>Payment Structure:</w:t>
       </w:r>
     </w:p>
-    <!-- Spacer -->
-    <w:p>
-      <w:pPr>
-        <w:rPr>
-          <w:sz w:val="20"/>
-        </w:rPr>
-      </w:pPr>
-    </w:p>
-    <!-- Payment details -->
-    <w:p>
-      <w:pPr>
-        <w:rPr>
-          <w:sz w:val="20"/>
-        </w:rPr>
-      </w:pPr>
-      <w:r>
-        <w:rPr>
-          <w:sz w:val="20"/>
-        </w:rPr>
+    <w:p>
+      <w:r>
+        <w:t/>
+      </w:r>
+    </w:p>
+    <w:p>
+      <w:r>
         <w:t>{{paymentText}}</w:t>
       </w:r>
     </w:p>
-    <!-- Spacer -->
-    <w:p>
-      <w:pPr>
-        <w:rPr>
-          <w:sz w:val="20"/>
-        </w:rPr>
-      </w:pPr>
-    </w:p>
-    <!-- Closing -->
-    <w:p>
-      <w:pPr>
-        <w:rPr>
-          <w:sz w:val="20"/>
-        </w:rPr>
-      </w:pPr>
-      <w:r>
-        <w:rPr>
-          <w:sz w:val="20"/>
-        </w:rPr>
-        <w:t xml:space="preserve">This offer is subject to due diligence and legal contract. I trust this offer meets with your approval and await your response. Following the acceptance of this offer, a heads of terms document will be submitted and negotiated to include agreements on working capital, exclusivity period and a timetable for due diligence and legal contract.</w:t>
-      </w:r>
-    </w:p>
-    <!-- Spacer -->
-    <w:p>
-      <w:pPr>
-        <w:rPr>
-          <w:sz w:val="20"/>
-        </w:rPr>
-      </w:pPr>
-    </w:p>
-    <!-- Sign off -->
-    <w:p>
-      <w:pPr>
-        <w:rPr>
-          <w:sz w:val="20"/>
-        </w:rPr>
-      </w:pPr>
-      <w:r>
-        <w:rPr>
-          <w:sz w:val="20"/>
-        </w:rPr>
+    <w:p>
+      <w:r>
+        <w:t/>
+      </w:r>
+    </w:p>
+    <w:p>
+      <w:r>
+        <w:t>This offer is subject to due diligence and legal contract. I trust this offer meets with your approval and await your response. Following the acceptance of this offer, a heads of terms document will be submitted and negotiated to include agreements on working capital, exclusivity period and a timetable for due diligence and legal contract.</w:t>
+      </w:r>
+    </w:p>
+    <w:p>
+      <w:r>
+        <w:t/>
+      </w:r>
+    </w:p>
+    <w:p>
+      <w:r>
         <w:t>Yours sincerely,</w:t>
       </w:r>
     </w:p>
-    <!-- Spacer -->
-    <w:p>
-      <w:pPr>
-        <w:rPr>
-          <w:sz w:val="20"/>
-        </w:rPr>
-      </w:pPr>
-    </w:p>
-    <!-- Signatory -->
-    <w:p>
-      <w:pPr>
-        <w:rPr>
-          <w:b/>
-          <w:sz w:val="20"/>
-        </w:rPr>
-      </w:pPr>
-      <w:r>
-        <w:rPr>
-          <w:b/>
-          <w:sz w:val="20"/>
-        </w:rPr>
+    <w:p>
+      <w:r>
+        <w:t/>
+      </w:r>
+    </w:p>
+    <w:p>
+      <w:r>
         <w:t>{{buyerSignatoryName}}</w:t>
       </w:r>
     </w:p>
     <w:p>
-      <w:pPr>
-        <w:rPr>
-          <w:sz w:val="20"/>
-        </w:rPr>
-      </w:pPr>
-      <w:r>
-        <w:rPr>
-          <w:sz w:val="20"/>
-        </w:rPr>
+      <w:r>
         <w:t>{{buyerSignatoryTitle}}</w:t>
       </w:r>
     </w:p>
     <w:p>
-      <w:pPr>
-        <w:rPr>
-          <w:sz w:val="20"/>
-        </w:rPr>
-      </w:pPr>
-      <w:r>
-        <w:rPr>
-          <w:sz w:val="20"/>
-        </w:rPr>
+      <w:r>
         <w:t>{{buyerCompanyName}}</w:t>
       </w:r>
     </w:p>
-    <w:sectPr>
-      <w:pgSz w:w="11906" w:h="16838"/>
-      <w:pgMar w:top="1440" w:right="1440" w:bottom="1440" w:left="1440" w:header="720" w:footer="720" w:gutter="0"/>
-    </w:sectPr>
+    <w:sectPr/>
   </w:body>
 </w:document>
 </file>

</xml_diff>